<commit_message>
Add inactive mast filtering
</commit_message>
<xml_diff>
--- a/docs/测风数据邮件日报监测工具_客户使用手册.docx
+++ b/docs/测风数据邮件日报监测工具_客户使用手册.docx
@@ -1831,6 +1831,38 @@
           </w:p>
         </w:tc>
       </w:tr>
+      <w:tr>
+        <w:tc>
+          <w:tcPr>
+            <w:tcW w:type="dxa" w:w="4986"/>
+            <w:vAlign w:val="center"/>
+          </w:tcPr>
+          <w:p>
+            <w:r>
+              <w:rPr>
+                <w:rFonts w:ascii="Microsoft YaHei" w:hAnsi="Microsoft YaHei" w:eastAsia="Microsoft YaHei"/>
+                <w:sz w:val="19"/>
+              </w:rPr>
+              <w:t>无效塔号</w:t>
+            </w:r>
+          </w:p>
+        </w:tc>
+        <w:tc>
+          <w:tcPr>
+            <w:tcW w:type="dxa" w:w="4986"/>
+            <w:vAlign w:val="center"/>
+          </w:tcPr>
+          <w:p>
+            <w:r>
+              <w:rPr>
+                <w:rFonts w:ascii="Microsoft YaHei" w:hAnsi="Microsoft YaHei" w:eastAsia="Microsoft YaHei"/>
+                <w:sz w:val="19"/>
+              </w:rPr>
+              <w:t>每行一个塔号。适用于倒塔、拆除或永久停用后不再需要监测的测风塔</w:t>
+            </w:r>
+          </w:p>
+        </w:tc>
+      </w:tr>
     </w:tbl>
     <w:p/>
     <w:p>
@@ -1864,6 +1896,60 @@
           <w:sz w:val="21"/>
         </w:rPr>
         <w:t>主题关键词填写后，软件优先处理主题包含关键词的邮件。</w:t>
+      </w:r>
+    </w:p>
+    <w:p>
+      <w:pPr>
+        <w:pStyle w:val="ListBullet"/>
+      </w:pPr>
+      <w:r>
+        <w:rPr>
+          <w:rFonts w:ascii="Microsoft YaHei" w:hAnsi="Microsoft YaHei" w:eastAsia="Microsoft YaHei"/>
+          <w:sz w:val="21"/>
+        </w:rPr>
+        <w:t>无效塔号填写后，软件不再保存该塔号的新附件；已有历史记录也不会参与接收、缺测、连续缺测或异常提醒。</w:t>
+      </w:r>
+    </w:p>
+    <w:p>
+      <w:pPr>
+        <w:pStyle w:val="ListBullet"/>
+      </w:pPr>
+      <w:r>
+        <w:rPr>
+          <w:rFonts w:ascii="Microsoft YaHei" w:hAnsi="Microsoft YaHei" w:eastAsia="Microsoft YaHei"/>
+          <w:sz w:val="21"/>
+        </w:rPr>
+        <w:t xml:space="preserve">塔号可填写带前导零或不带前导零的形式，例如 </w:t>
+      </w:r>
+      <w:r>
+        <w:rPr>
+          <w:rFonts w:ascii="Microsoft YaHei" w:hAnsi="Microsoft YaHei" w:eastAsia="Microsoft YaHei"/>
+          <w:color w:val="205493"/>
+          <w:sz w:val="21"/>
+        </w:rPr>
+        <w:t>009357</w:t>
+      </w:r>
+      <w:r>
+        <w:rPr>
+          <w:rFonts w:ascii="Microsoft YaHei" w:hAnsi="Microsoft YaHei" w:eastAsia="Microsoft YaHei"/>
+          <w:sz w:val="21"/>
+        </w:rPr>
+        <w:t xml:space="preserve"> 与 </w:t>
+      </w:r>
+      <w:r>
+        <w:rPr>
+          <w:rFonts w:ascii="Microsoft YaHei" w:hAnsi="Microsoft YaHei" w:eastAsia="Microsoft YaHei"/>
+          <w:color w:val="205493"/>
+          <w:sz w:val="21"/>
+        </w:rPr>
+        <w:t>9357</w:t>
+      </w:r>
+      <w:r>
+        <w:rPr>
+          <w:rFonts w:ascii="Microsoft YaHei" w:hAnsi="Microsoft YaHei" w:eastAsia="Microsoft YaHei"/>
+          <w:sz w:val="21"/>
+        </w:rPr>
+        <w:t xml:space="preserve"> 会识别为同一塔号。</w:t>
       </w:r>
     </w:p>
     <w:p>

</xml_diff>

<commit_message>
Replace inactive masts with monitoring whitelist
</commit_message>
<xml_diff>
--- a/docs/测风数据邮件日报监测工具_客户使用手册.docx
+++ b/docs/测风数据邮件日报监测工具_客户使用手册.docx
@@ -1843,7 +1843,7 @@
                 <w:rFonts w:ascii="Microsoft YaHei" w:hAnsi="Microsoft YaHei" w:eastAsia="Microsoft YaHei"/>
                 <w:sz w:val="19"/>
               </w:rPr>
-              <w:t>无效塔号</w:t>
+              <w:t>关注塔号白名单</w:t>
             </w:r>
           </w:p>
         </w:tc>
@@ -1858,7 +1858,7 @@
                 <w:rFonts w:ascii="Microsoft YaHei" w:hAnsi="Microsoft YaHei" w:eastAsia="Microsoft YaHei"/>
                 <w:sz w:val="19"/>
               </w:rPr>
-              <w:t>每行一个塔号。适用于倒塔、拆除或永久停用后不再需要监测的测风塔</w:t>
+              <w:t>每行一个塔号。为空时按原识别逻辑；填写后以白名单作为需要持续检查缺测的塔号范围</w:t>
             </w:r>
           </w:p>
         </w:tc>
@@ -1907,7 +1907,7 @@
           <w:rFonts w:ascii="Microsoft YaHei" w:hAnsi="Microsoft YaHei" w:eastAsia="Microsoft YaHei"/>
           <w:sz w:val="21"/>
         </w:rPr>
-        <w:t>无效塔号填写后，软件不再保存该塔号的新附件；已有历史记录也不会参与接收、缺测、连续缺测或异常提醒。</w:t>
+        <w:t>白名单为空时，软件按历史上识别过的塔号判断缺测，行为与原版本一致。</w:t>
       </w:r>
     </w:p>
     <w:p>
@@ -1919,7 +1919,19 @@
           <w:rFonts w:ascii="Microsoft YaHei" w:hAnsi="Microsoft YaHei" w:eastAsia="Microsoft YaHei"/>
           <w:sz w:val="21"/>
         </w:rPr>
-        <w:t xml:space="preserve">塔号可填写带前导零或不带前导零的形式，例如 </w:t>
+        <w:t>白名单有内容时，软件只分析白名单塔号，以及邮件主题命中主题关键词的数据；只有白名单塔号参与缺测和连续缺测判断。</w:t>
+      </w:r>
+    </w:p>
+    <w:p>
+      <w:pPr>
+        <w:pStyle w:val="ListBullet"/>
+      </w:pPr>
+      <w:r>
+        <w:rPr>
+          <w:rFonts w:ascii="Microsoft YaHei" w:hAnsi="Microsoft YaHei" w:eastAsia="Microsoft YaHei"/>
+          <w:sz w:val="21"/>
+        </w:rPr>
+        <w:t xml:space="preserve">白名单塔号可填写带前导零或不带前导零的形式，例如 </w:t>
       </w:r>
       <w:r>
         <w:rPr>

</xml_diff>

<commit_message>
Expand customer user manual
</commit_message>
<xml_diff>
--- a/docs/测风数据邮件日报监测工具_客户使用手册.docx
+++ b/docs/测风数据邮件日报监测工具_客户使用手册.docx
@@ -33,6 +33,24 @@
           <w:sz w:val="21"/>
         </w:rPr>
         <w:t>当前版本：V1.4.0</w:t>
+      </w:r>
+    </w:p>
+    <w:p>
+      <w:r>
+        <w:rPr>
+          <w:rFonts w:ascii="Microsoft YaHei" w:hAnsi="Microsoft YaHei" w:eastAsia="Microsoft YaHei"/>
+          <w:sz w:val="21"/>
+        </w:rPr>
+        <w:t>手册版本：客户版 V1.0</w:t>
+      </w:r>
+    </w:p>
+    <w:p>
+      <w:r>
+        <w:rPr>
+          <w:rFonts w:ascii="Microsoft YaHei" w:hAnsi="Microsoft YaHei" w:eastAsia="Microsoft YaHei"/>
+          <w:sz w:val="21"/>
+        </w:rPr>
+        <w:t>更新日期：2026 年 7 月 18 日</w:t>
       </w:r>
     </w:p>
     <w:p>
@@ -653,6 +671,125 @@
     </w:p>
     <w:p>
       <w:pPr>
+        <w:spacing w:before="120" w:after="100"/>
+      </w:pPr>
+      <w:r>
+        <w:rPr>
+          <w:rFonts w:ascii="Microsoft YaHei" w:hAnsi="Microsoft YaHei" w:eastAsia="Microsoft YaHei"/>
+          <w:b/>
+          <w:color w:val="1F1F1F"/>
+          <w:sz w:val="25"/>
+        </w:rPr>
+        <w:t>3.1 每日快速操作</w:t>
+      </w:r>
+    </w:p>
+    <w:p>
+      <w:r>
+        <w:rPr>
+          <w:rFonts w:ascii="Microsoft YaHei" w:hAnsi="Microsoft YaHei" w:eastAsia="Microsoft YaHei"/>
+          <w:sz w:val="21"/>
+        </w:rPr>
+        <w:t>完成首次授权和配置后，每天通常只需执行以下操作：</w:t>
+      </w:r>
+    </w:p>
+    <w:p>
+      <w:pPr>
+        <w:pStyle w:val="ListNumber"/>
+      </w:pPr>
+      <w:r>
+        <w:rPr>
+          <w:rFonts w:ascii="Microsoft YaHei" w:hAnsi="Microsoft YaHei" w:eastAsia="Microsoft YaHei"/>
+          <w:sz w:val="21"/>
+        </w:rPr>
+        <w:t xml:space="preserve">双击 </w:t>
+      </w:r>
+      <w:r>
+        <w:rPr>
+          <w:rFonts w:ascii="Microsoft YaHei" w:hAnsi="Microsoft YaHei" w:eastAsia="Microsoft YaHei"/>
+          <w:color w:val="205493"/>
+          <w:sz w:val="21"/>
+        </w:rPr>
+        <w:t>WindMailMonitor.exe</w:t>
+      </w:r>
+      <w:r>
+        <w:rPr>
+          <w:rFonts w:ascii="Microsoft YaHei" w:hAnsi="Microsoft YaHei" w:eastAsia="Microsoft YaHei"/>
+          <w:sz w:val="21"/>
+        </w:rPr>
+        <w:t>。</w:t>
+      </w:r>
+    </w:p>
+    <w:p>
+      <w:pPr>
+        <w:pStyle w:val="ListNumber"/>
+      </w:pPr>
+      <w:r>
+        <w:rPr>
+          <w:rFonts w:ascii="Microsoft YaHei" w:hAnsi="Microsoft YaHei" w:eastAsia="Microsoft YaHei"/>
+          <w:sz w:val="21"/>
+        </w:rPr>
+        <w:t>进入“运行”页面。</w:t>
+      </w:r>
+    </w:p>
+    <w:p>
+      <w:pPr>
+        <w:pStyle w:val="ListNumber"/>
+      </w:pPr>
+      <w:r>
+        <w:rPr>
+          <w:rFonts w:ascii="Microsoft YaHei" w:hAnsi="Microsoft YaHei" w:eastAsia="Microsoft YaHei"/>
+          <w:sz w:val="21"/>
+        </w:rPr>
+        <w:t>确认统计日期。软件默认显示前一天日期。</w:t>
+      </w:r>
+    </w:p>
+    <w:p>
+      <w:pPr>
+        <w:pStyle w:val="ListNumber"/>
+      </w:pPr>
+      <w:r>
+        <w:rPr>
+          <w:rFonts w:ascii="Microsoft YaHei" w:hAnsi="Microsoft YaHei" w:eastAsia="Microsoft YaHei"/>
+          <w:sz w:val="21"/>
+        </w:rPr>
+        <w:t>点击“立即生成日报”。</w:t>
+      </w:r>
+    </w:p>
+    <w:p>
+      <w:pPr>
+        <w:pStyle w:val="ListNumber"/>
+      </w:pPr>
+      <w:r>
+        <w:rPr>
+          <w:rFonts w:ascii="Microsoft YaHei" w:hAnsi="Microsoft YaHei" w:eastAsia="Microsoft YaHei"/>
+          <w:sz w:val="21"/>
+        </w:rPr>
+        <w:t>等待运行日志显示“任务完成”。</w:t>
+      </w:r>
+    </w:p>
+    <w:p>
+      <w:pPr>
+        <w:pStyle w:val="ListNumber"/>
+      </w:pPr>
+      <w:r>
+        <w:rPr>
+          <w:rFonts w:ascii="Microsoft YaHei" w:hAnsi="Microsoft YaHei" w:eastAsia="Microsoft YaHei"/>
+          <w:sz w:val="21"/>
+        </w:rPr>
+        <w:t>点击“打开报告目录”，检查 Excel 或 HTML 日报。</w:t>
+      </w:r>
+    </w:p>
+    <w:p>
+      <w:r>
+        <w:rPr>
+          <w:rFonts w:ascii="Microsoft YaHei" w:hAnsi="Microsoft YaHei" w:eastAsia="Microsoft YaHei"/>
+          <w:sz w:val="21"/>
+        </w:rPr>
+        <w:t>如需重新生成已经统计过的日期，可勾选“不连接邮箱，仅根据数据库重新生成日报”，避免重复读取邮箱。</w:t>
+      </w:r>
+    </w:p>
+    <w:p>
+      <w:pPr>
         <w:spacing w:before="200" w:after="100"/>
       </w:pPr>
       <w:r>
@@ -2393,7 +2530,7 @@
                 <w:rFonts w:ascii="Microsoft YaHei" w:hAnsi="Microsoft YaHei" w:eastAsia="Microsoft YaHei"/>
                 <w:sz w:val="19"/>
               </w:rPr>
-              <w:t>当天未收到但历史上出现过的测风塔</w:t>
+              <w:t>白名单为空时显示历史上出现但当天未收到的塔号；填写白名单后只检查白名单塔号</w:t>
             </w:r>
           </w:p>
         </w:tc>
@@ -2548,7 +2685,30 @@
           <w:rFonts w:ascii="Microsoft YaHei" w:hAnsi="Microsoft YaHei" w:eastAsia="Microsoft YaHei"/>
           <w:sz w:val="21"/>
         </w:rPr>
-        <w:t>软件会根据历史已出现过的塔号建立“应到清单”，再与统计日期当天实际收到的数据进行比较。</w:t>
+        <w:t>软件采用以下两种缺测判断模式：</w:t>
+      </w:r>
+    </w:p>
+    <w:p>
+      <w:pPr>
+        <w:spacing w:before="120" w:after="100"/>
+      </w:pPr>
+      <w:r>
+        <w:rPr>
+          <w:rFonts w:ascii="Microsoft YaHei" w:hAnsi="Microsoft YaHei" w:eastAsia="Microsoft YaHei"/>
+          <w:b/>
+          <w:color w:val="1F1F1F"/>
+          <w:sz w:val="25"/>
+        </w:rPr>
+        <w:t>9.1 未填写关注塔号白名单</w:t>
+      </w:r>
+    </w:p>
+    <w:p>
+      <w:r>
+        <w:rPr>
+          <w:rFonts w:ascii="Microsoft YaHei" w:hAnsi="Microsoft YaHei" w:eastAsia="Microsoft YaHei"/>
+          <w:sz w:val="21"/>
+        </w:rPr>
+        <w:t>软件会根据历史上已经识别过的塔号建立“应到清单”，再与统计日期当天实际收到的数据进行比较。</w:t>
       </w:r>
     </w:p>
     <w:p>
@@ -2663,6 +2823,158 @@
           <w:sz w:val="21"/>
         </w:rPr>
         <w:t>这种逻辑不要求先生成前一天日报。只要数据库中已有历史接收记录，第一次统计当天就能显示缺测结果。</w:t>
+      </w:r>
+    </w:p>
+    <w:p>
+      <w:pPr>
+        <w:spacing w:before="120" w:after="100"/>
+      </w:pPr>
+      <w:r>
+        <w:rPr>
+          <w:rFonts w:ascii="Microsoft YaHei" w:hAnsi="Microsoft YaHei" w:eastAsia="Microsoft YaHei"/>
+          <w:b/>
+          <w:color w:val="1F1F1F"/>
+          <w:sz w:val="25"/>
+        </w:rPr>
+        <w:t>9.2 已填写关注塔号白名单</w:t>
+      </w:r>
+    </w:p>
+    <w:p>
+      <w:r>
+        <w:rPr>
+          <w:rFonts w:ascii="Microsoft YaHei" w:hAnsi="Microsoft YaHei" w:eastAsia="Microsoft YaHei"/>
+          <w:sz w:val="21"/>
+        </w:rPr>
+        <w:t>软件直接将白名单作为“应到清单”，不再把其他历史塔号加入缺测提醒。</w:t>
+      </w:r>
+    </w:p>
+    <w:p>
+      <w:r>
+        <w:rPr>
+          <w:rFonts w:ascii="Microsoft YaHei" w:hAnsi="Microsoft YaHei" w:eastAsia="Microsoft YaHei"/>
+          <w:sz w:val="21"/>
+        </w:rPr>
+        <w:t>举例：</w:t>
+      </w:r>
+    </w:p>
+    <w:p>
+      <w:pPr>
+        <w:pStyle w:val="ListBullet"/>
+      </w:pPr>
+      <w:r>
+        <w:rPr>
+          <w:rFonts w:ascii="Microsoft YaHei" w:hAnsi="Microsoft YaHei" w:eastAsia="Microsoft YaHei"/>
+          <w:sz w:val="21"/>
+        </w:rPr>
+        <w:t xml:space="preserve">白名单填写 </w:t>
+      </w:r>
+      <w:r>
+        <w:rPr>
+          <w:rFonts w:ascii="Microsoft YaHei" w:hAnsi="Microsoft YaHei" w:eastAsia="Microsoft YaHei"/>
+          <w:color w:val="205493"/>
+          <w:sz w:val="21"/>
+        </w:rPr>
+        <w:t>9357</w:t>
+      </w:r>
+      <w:r>
+        <w:rPr>
+          <w:rFonts w:ascii="Microsoft YaHei" w:hAnsi="Microsoft YaHei" w:eastAsia="Microsoft YaHei"/>
+          <w:sz w:val="21"/>
+        </w:rPr>
+        <w:t>、</w:t>
+      </w:r>
+      <w:r>
+        <w:rPr>
+          <w:rFonts w:ascii="Microsoft YaHei" w:hAnsi="Microsoft YaHei" w:eastAsia="Microsoft YaHei"/>
+          <w:color w:val="205493"/>
+          <w:sz w:val="21"/>
+        </w:rPr>
+        <w:t>9088</w:t>
+      </w:r>
+      <w:r>
+        <w:rPr>
+          <w:rFonts w:ascii="Microsoft YaHei" w:hAnsi="Microsoft YaHei" w:eastAsia="Microsoft YaHei"/>
+          <w:sz w:val="21"/>
+        </w:rPr>
+        <w:t>。</w:t>
+      </w:r>
+    </w:p>
+    <w:p>
+      <w:pPr>
+        <w:pStyle w:val="ListBullet"/>
+      </w:pPr>
+      <w:r>
+        <w:rPr>
+          <w:rFonts w:ascii="Microsoft YaHei" w:hAnsi="Microsoft YaHei" w:eastAsia="Microsoft YaHei"/>
+          <w:sz w:val="21"/>
+        </w:rPr>
+        <w:t xml:space="preserve">统计日期当天收到 </w:t>
+      </w:r>
+      <w:r>
+        <w:rPr>
+          <w:rFonts w:ascii="Microsoft YaHei" w:hAnsi="Microsoft YaHei" w:eastAsia="Microsoft YaHei"/>
+          <w:color w:val="205493"/>
+          <w:sz w:val="21"/>
+        </w:rPr>
+        <w:t>9357</w:t>
+      </w:r>
+      <w:r>
+        <w:rPr>
+          <w:rFonts w:ascii="Microsoft YaHei" w:hAnsi="Microsoft YaHei" w:eastAsia="Microsoft YaHei"/>
+          <w:sz w:val="21"/>
+        </w:rPr>
+        <w:t xml:space="preserve">，没有收到 </w:t>
+      </w:r>
+      <w:r>
+        <w:rPr>
+          <w:rFonts w:ascii="Microsoft YaHei" w:hAnsi="Microsoft YaHei" w:eastAsia="Microsoft YaHei"/>
+          <w:color w:val="205493"/>
+          <w:sz w:val="21"/>
+        </w:rPr>
+        <w:t>9088</w:t>
+      </w:r>
+      <w:r>
+        <w:rPr>
+          <w:rFonts w:ascii="Microsoft YaHei" w:hAnsi="Microsoft YaHei" w:eastAsia="Microsoft YaHei"/>
+          <w:sz w:val="21"/>
+        </w:rPr>
+        <w:t>。</w:t>
+      </w:r>
+    </w:p>
+    <w:p>
+      <w:pPr>
+        <w:pStyle w:val="ListBullet"/>
+      </w:pPr>
+      <w:r>
+        <w:rPr>
+          <w:rFonts w:ascii="Microsoft YaHei" w:hAnsi="Microsoft YaHei" w:eastAsia="Microsoft YaHei"/>
+          <w:sz w:val="21"/>
+        </w:rPr>
+        <w:t xml:space="preserve">日报只会将 </w:t>
+      </w:r>
+      <w:r>
+        <w:rPr>
+          <w:rFonts w:ascii="Microsoft YaHei" w:hAnsi="Microsoft YaHei" w:eastAsia="Microsoft YaHei"/>
+          <w:color w:val="205493"/>
+          <w:sz w:val="21"/>
+        </w:rPr>
+        <w:t>9088</w:t>
+      </w:r>
+      <w:r>
+        <w:rPr>
+          <w:rFonts w:ascii="Microsoft YaHei" w:hAnsi="Microsoft YaHei" w:eastAsia="Microsoft YaHei"/>
+          <w:sz w:val="21"/>
+        </w:rPr>
+        <w:t xml:space="preserve"> 标记为缺测；数据库中其他历史塔号不会进入缺测列表。</w:t>
+      </w:r>
+    </w:p>
+    <w:p>
+      <w:r>
+        <w:rPr>
+          <w:rFonts w:ascii="Microsoft YaHei" w:hAnsi="Microsoft YaHei" w:eastAsia="Microsoft YaHei"/>
+          <w:sz w:val="21"/>
+        </w:rPr>
+        <w:t>白名单模式下，邮件主题命中“主题关键词”的数据仍会被分析并进入当日报表，但非白名单塔号不会因此成为以后必须持续检查的缺测对象。</w:t>
       </w:r>
     </w:p>
     <w:p>
@@ -3251,6 +3563,18 @@
     </w:p>
     <w:p>
       <w:pPr>
+        <w:pStyle w:val="ListBullet"/>
+      </w:pPr>
+      <w:r>
+        <w:rPr>
+          <w:rFonts w:ascii="Microsoft YaHei" w:hAnsi="Microsoft YaHei" w:eastAsia="Microsoft YaHei"/>
+          <w:sz w:val="21"/>
+        </w:rPr>
+        <w:t>如果已经填写关注塔号白名单，附件塔号是否在白名单中，或者邮件主题是否命中主题关键词。</w:t>
+      </w:r>
+    </w:p>
+    <w:p>
+      <w:pPr>
         <w:spacing w:before="120" w:after="100"/>
       </w:pPr>
       <w:r>
@@ -3260,7 +3584,87 @@
           <w:color w:val="1F1F1F"/>
           <w:sz w:val="25"/>
         </w:rPr>
-        <w:t>12.4 Excel 中显示未识别附件</w:t>
+        <w:t>12.4 出现不需要关注的缺失塔号</w:t>
+      </w:r>
+    </w:p>
+    <w:p>
+      <w:r>
+        <w:rPr>
+          <w:rFonts w:ascii="Microsoft YaHei" w:hAnsi="Microsoft YaHei" w:eastAsia="Microsoft YaHei"/>
+          <w:sz w:val="21"/>
+        </w:rPr>
+        <w:t>白名单为空时，软件会把数据库中历史识别过的塔号作为缺测基准。如果历史邮箱中包含其他项目的测风数据，这些塔号也可能进入缺失提醒。</w:t>
+      </w:r>
+    </w:p>
+    <w:p>
+      <w:r>
+        <w:rPr>
+          <w:rFonts w:ascii="Microsoft YaHei" w:hAnsi="Microsoft YaHei" w:eastAsia="Microsoft YaHei"/>
+          <w:sz w:val="21"/>
+        </w:rPr>
+        <w:t>处理方法：</w:t>
+      </w:r>
+    </w:p>
+    <w:p>
+      <w:pPr>
+        <w:pStyle w:val="ListNumber"/>
+      </w:pPr>
+      <w:r>
+        <w:rPr>
+          <w:rFonts w:ascii="Microsoft YaHei" w:hAnsi="Microsoft YaHei" w:eastAsia="Microsoft YaHei"/>
+          <w:sz w:val="21"/>
+        </w:rPr>
+        <w:t>进入“日报规则”页面。</w:t>
+      </w:r>
+    </w:p>
+    <w:p>
+      <w:pPr>
+        <w:pStyle w:val="ListNumber"/>
+      </w:pPr>
+      <w:r>
+        <w:rPr>
+          <w:rFonts w:ascii="Microsoft YaHei" w:hAnsi="Microsoft YaHei" w:eastAsia="Microsoft YaHei"/>
+          <w:sz w:val="21"/>
+        </w:rPr>
+        <w:t>在“关注塔号白名单”中填写当前项目需要持续检查的塔号，每行一个。</w:t>
+      </w:r>
+    </w:p>
+    <w:p>
+      <w:pPr>
+        <w:pStyle w:val="ListNumber"/>
+      </w:pPr>
+      <w:r>
+        <w:rPr>
+          <w:rFonts w:ascii="Microsoft YaHei" w:hAnsi="Microsoft YaHei" w:eastAsia="Microsoft YaHei"/>
+          <w:sz w:val="21"/>
+        </w:rPr>
+        <w:t>点击“保存设置”。</w:t>
+      </w:r>
+    </w:p>
+    <w:p>
+      <w:pPr>
+        <w:pStyle w:val="ListNumber"/>
+      </w:pPr>
+      <w:r>
+        <w:rPr>
+          <w:rFonts w:ascii="Microsoft YaHei" w:hAnsi="Microsoft YaHei" w:eastAsia="Microsoft YaHei"/>
+          <w:sz w:val="21"/>
+        </w:rPr>
+        <w:t>返回“运行”页面，重新生成日报。</w:t>
+      </w:r>
+    </w:p>
+    <w:p>
+      <w:pPr>
+        <w:spacing w:before="120" w:after="100"/>
+      </w:pPr>
+      <w:r>
+        <w:rPr>
+          <w:rFonts w:ascii="Microsoft YaHei" w:hAnsi="Microsoft YaHei" w:eastAsia="Microsoft YaHei"/>
+          <w:b/>
+          <w:color w:val="1F1F1F"/>
+          <w:sz w:val="25"/>
+        </w:rPr>
+        <w:t>12.5 Excel 中显示未识别附件</w:t>
       </w:r>
     </w:p>
     <w:p>
@@ -3340,7 +3744,7 @@
           <w:color w:val="1F1F1F"/>
           <w:sz w:val="25"/>
         </w:rPr>
-        <w:t>12.5 授权显示设备不匹配</w:t>
+        <w:t>12.6 授权显示设备不匹配</w:t>
       </w:r>
     </w:p>
     <w:p>

</xml_diff>